<commit_message>
added names to headers of each file
</commit_message>
<xml_diff>
--- a/McVitie-Wilson/CSI2120_TermProject_GoSubmission_NassarShakir_KobeBlackburn.docx
+++ b/McVitie-Wilson/CSI2120_TermProject_GoSubmission_NassarShakir_KobeBlackburn.docx
@@ -236,7 +236,7 @@
       </w:pPr>
       <w:r>
         <w:lastRenderedPageBreak/>
-        <w:t>U</w:t>
+        <w:t>Solution and Approach</w:t>
       </w:r>
     </w:p>
     <w:p>
@@ -256,33 +256,46 @@
     <w:p/>
     <w:p>
       <w:r>
-        <w:t xml:space="preserve">To run the program, the user must </w:t>
-      </w:r>
-      <w:r>
-        <w:t>first compile all classes then run the command “</w:t>
-      </w:r>
-      <w:r>
-        <w:t>go run</w:t>
+        <w:t>There</w:t>
+      </w:r>
+      <w:r>
+        <w:t xml:space="preserve"> are two subdirectories in the zip folder in our submission. The first being “Concurrent” and the other “Single”. These refer of course to the concurrent and single-</w:t>
+      </w:r>
+      <w:proofErr w:type="gramStart"/>
+      <w:r>
+        <w:t>threaded</w:t>
+      </w:r>
+      <w:proofErr w:type="gramEnd"/>
+      <w:r>
+        <w:t xml:space="preserve"> solutions. </w:t>
+      </w:r>
+    </w:p>
+    <w:p>
+      <w:r>
+        <w:t>To run the program, the user must first compile all classes then run the command “go run</w:t>
       </w:r>
       <w:r>
         <w:t xml:space="preserve"> </w:t>
       </w:r>
       <w:r>
-        <w:t>McVitie-Wilson.go</w:t>
-      </w:r>
-      <w:r>
-        <w:t xml:space="preserve">” </w:t>
-      </w:r>
-      <w:r>
-        <w:t xml:space="preserve">in the terminal. </w:t>
-      </w:r>
-      <w:r>
-        <w:t>There</w:t>
-      </w:r>
-      <w:r>
-        <w:t xml:space="preserve"> are two subdirectories in the zip folder in our submission. The first being “Concurrent” and the other “Single”. These refer of course to the concurrent and single-threaded solutions. Within each subdirectory contains the csv files for the large datasets and they will run without issue. Ensure that before attempting to run the Go program you are in the desired subdirectory.</w:t>
+        <w:t>McVitie-</w:t>
+      </w:r>
+      <w:proofErr w:type="spellStart"/>
+      <w:r>
+        <w:t>Wilson.go</w:t>
+      </w:r>
+      <w:proofErr w:type="spellEnd"/>
+      <w:r>
+        <w:t>” in the terminal.</w:t>
+      </w:r>
+      <w:r>
+        <w:t xml:space="preserve"> </w:t>
+      </w:r>
+      <w:r>
+        <w:t>Within each subdirectory contains the csv files for the large datasets and they will run without issue. Ensure that before attempting to run the Go program you are in the desired subdirectory.</w:t>
       </w:r>
     </w:p>
+    <w:p/>
     <w:p/>
     <w:sectPr>
       <w:pgSz w:w="12240" w:h="15840"/>

</xml_diff>